<commit_message>
Recursos en kit Word
Co-Authored-By: Claude Opus 5.5 <noreply@anthropic.com>
Claude-Session: https://claude.ai/code/session_01Rocjdfh1Pjtd88xFKASCg5
</commit_message>
<xml_diff>
--- a/descargas/kit-de-investigacion-inclusiva.docx
+++ b/descargas/kit-de-investigacion-inclusiva.docx
@@ -555,6 +555,50 @@
           <w:rFonts w:ascii="Arial" w:cs="Arial" w:eastAsia="Arial" w:hAnsi="Arial"/>
         </w:rPr>
         <w:t xml:space="preserve">La idea que une las cuatro: cuando algo falla en una sesión, empieza por buscar la barrera en el producto o en la propia investigación, antes que en la persona.</w:t>
+      </w:r>
+    </w:p>
+    <w:p>
+      <w:pPr>
+        <w:pStyle w:val="Heading2"/>
+      </w:pPr>
+      <w:r>
+        <w:rPr>
+          <w:rFonts w:ascii="Arial" w:cs="Arial" w:eastAsia="Arial" w:hAnsi="Arial"/>
+        </w:rPr>
+        <w:t xml:space="preserve">Recursos</w:t>
+      </w:r>
+    </w:p>
+    <w:p>
+      <w:pPr>
+        <w:spacing w:after="80" w:line="300"/>
+      </w:pPr>
+      <w:hyperlink w:history="1" r:id="rIdRecursoLF">
+        <w:r>
+          <w:rPr>
+            <w:rStyle w:val="Hyperlink"/>
+            <w:rFonts w:ascii="Arial" w:cs="Arial" w:eastAsia="Arial" w:hAnsi="Arial"/>
+          </w:rPr>
+          <w:t xml:space="preserve">Lectura fácil y web comprensible: un libro blanco en el marco del nuevo reglamento</w:t>
+        </w:r>
+      </w:hyperlink>
+      <w:r>
+        <w:rPr>
+          <w:rFonts w:ascii="Arial" w:cs="Arial" w:eastAsia="Arial" w:hAnsi="Arial"/>
+        </w:rPr>
+        <w:t xml:space="preserve"> (PDF)</w:t>
+      </w:r>
+    </w:p>
+    <w:p>
+      <w:pPr>
+        <w:spacing w:after="160" w:line="300"/>
+      </w:pPr>
+      <w:r>
+        <w:rPr>
+          <w:color w:val="595959"/>
+          <w:sz w:val="20"/>
+          <w:rFonts w:ascii="Arial" w:cs="Arial" w:eastAsia="Arial" w:hAnsi="Arial"/>
+        </w:rPr>
+        <w:t xml:space="preserve">María Xesús Bello Rivas y Óscar García Muñoz. Universidad Nebrija, 2026. Útil para preparar consentimientos y materiales en lectura fácil.</w:t>
       </w:r>
     </w:p>
     <w:p>

</xml_diff>